<commit_message>
stock buy and selling
</commit_message>
<xml_diff>
--- a/Apna college sheet DSA/Array/Self Notes.docx
+++ b/Apna college sheet DSA/Array/Self Notes.docx
@@ -3241,7 +3241,880 @@
     </w:tbl>
     <w:p/>
     <w:p/>
+    <w:p>
+      <w:pPr>
+        <w:rPr>
+          <w:sz w:val="26"/>
+          <w:szCs w:val="26"/>
+        </w:rPr>
+      </w:pPr>
+      <w:r>
+        <w:rPr>
+          <w:b/>
+          <w:bCs/>
+          <w:sz w:val="32"/>
+          <w:szCs w:val="32"/>
+          <w:u w:val="single"/>
+        </w:rPr>
+        <w:t xml:space="preserve">121) Stock Buy and selling </w:t>
+      </w:r>
+    </w:p>
+    <w:p>
+      <w:r>
+        <w:rPr>
+          <w:b/>
+          <w:bCs/>
+        </w:rPr>
+        <w:t xml:space="preserve">Problem </w:t>
+      </w:r>
+      <w:proofErr w:type="gramStart"/>
+      <w:r>
+        <w:rPr>
+          <w:b/>
+          <w:bCs/>
+        </w:rPr>
+        <w:t>Statement :</w:t>
+      </w:r>
+      <w:proofErr w:type="gramEnd"/>
+    </w:p>
+    <w:p>
+      <w:pPr>
+        <w:pStyle w:val="NoSpacing"/>
+      </w:pPr>
+      <w:r>
+        <w:t>You are given an array </w:t>
+      </w:r>
+      <w:proofErr w:type="gramStart"/>
+      <w:r>
+        <w:rPr>
+          <w:b/>
+          <w:bCs/>
+        </w:rPr>
+        <w:t>prices</w:t>
+      </w:r>
+      <w:proofErr w:type="gramEnd"/>
+      <w:r>
+        <w:t> where </w:t>
+      </w:r>
+      <w:r>
+        <w:rPr>
+          <w:b/>
+          <w:bCs/>
+        </w:rPr>
+        <w:t>prices[</w:t>
+      </w:r>
+      <w:proofErr w:type="spellStart"/>
+      <w:r>
+        <w:rPr>
+          <w:b/>
+          <w:bCs/>
+        </w:rPr>
+        <w:t>i</w:t>
+      </w:r>
+      <w:proofErr w:type="spellEnd"/>
+      <w:r>
+        <w:rPr>
+          <w:b/>
+          <w:bCs/>
+        </w:rPr>
+        <w:t>] </w:t>
+      </w:r>
+      <w:r>
+        <w:t>is the price of a given stock on the</w:t>
+      </w:r>
+      <w:r>
+        <w:rPr>
+          <w:b/>
+          <w:bCs/>
+        </w:rPr>
+        <w:t> </w:t>
+      </w:r>
+      <w:proofErr w:type="spellStart"/>
+      <w:r>
+        <w:rPr>
+          <w:b/>
+          <w:bCs/>
+        </w:rPr>
+        <w:t>i</w:t>
+      </w:r>
+      <w:proofErr w:type="spellEnd"/>
+      <w:r>
+        <w:rPr>
+          <w:b/>
+          <w:bCs/>
+        </w:rPr>
+        <w:t xml:space="preserve"> </w:t>
+      </w:r>
+      <w:proofErr w:type="spellStart"/>
+      <w:r>
+        <w:rPr>
+          <w:b/>
+          <w:bCs/>
+        </w:rPr>
+        <w:t>th</w:t>
+      </w:r>
+      <w:proofErr w:type="spellEnd"/>
+      <w:r>
+        <w:t> day.</w:t>
+      </w:r>
+    </w:p>
+    <w:p>
+      <w:r>
+        <w:t>You want to maximize your profit by choosing a single day to buy one stock and choosing a different day in the future to sell that stock. Return the maximum profit you can achieve from this transaction. If you cannot achieve any profit, return 0.</w:t>
+      </w:r>
+    </w:p>
     <w:p/>
+    <w:p/>
+    <w:p>
+      <w:pPr>
+        <w:pStyle w:val="NoSpacing"/>
+        <w:rPr>
+          <w:b/>
+          <w:bCs/>
+        </w:rPr>
+      </w:pPr>
+      <w:proofErr w:type="gramStart"/>
+      <w:r>
+        <w:rPr>
+          <w:b/>
+          <w:bCs/>
+        </w:rPr>
+        <w:t>Approach</w:t>
+      </w:r>
+      <w:r>
+        <w:rPr>
+          <w:b/>
+          <w:bCs/>
+        </w:rPr>
+        <w:t>(</w:t>
+      </w:r>
+      <w:proofErr w:type="gramEnd"/>
+      <w:r>
+        <w:rPr>
+          <w:b/>
+          <w:bCs/>
+        </w:rPr>
+        <w:t>Naïve)</w:t>
+      </w:r>
+    </w:p>
+    <w:p>
+      <w:pPr>
+        <w:pStyle w:val="NoSpacing"/>
+      </w:pPr>
+      <w:r>
+        <w:rPr>
+          <w:b/>
+          <w:bCs/>
+        </w:rPr>
+        <w:t xml:space="preserve">Using nested for </w:t>
+      </w:r>
+      <w:proofErr w:type="gramStart"/>
+      <w:r>
+        <w:rPr>
+          <w:b/>
+          <w:bCs/>
+        </w:rPr>
+        <w:t>loop :</w:t>
+      </w:r>
+      <w:proofErr w:type="gramEnd"/>
+    </w:p>
+    <w:p>
+      <w:pPr>
+        <w:pStyle w:val="NoSpacing"/>
+      </w:pPr>
+    </w:p>
+    <w:p>
+      <w:pPr>
+        <w:pStyle w:val="NoSpacing"/>
+      </w:pPr>
+      <w:r>
+        <w:t>To find the maximum profit, we inspect all possible (</w:t>
+      </w:r>
+      <w:proofErr w:type="spellStart"/>
+      <w:proofErr w:type="gramStart"/>
+      <w:r>
+        <w:t>buy,sell</w:t>
+      </w:r>
+      <w:proofErr w:type="spellEnd"/>
+      <w:proofErr w:type="gramEnd"/>
+      <w:r>
+        <w:t>) pairs using nested for loop. </w:t>
+      </w:r>
+    </w:p>
+    <w:p>
+      <w:pPr>
+        <w:pStyle w:val="NoSpacing"/>
+      </w:pPr>
+    </w:p>
+    <w:p>
+      <w:pPr>
+        <w:pStyle w:val="NoSpacing"/>
+      </w:pPr>
+      <w:r>
+        <w:t>1. Initialize profit = 0 and n = length of price array.</w:t>
+      </w:r>
+    </w:p>
+    <w:p>
+      <w:pPr>
+        <w:pStyle w:val="NoSpacing"/>
+      </w:pPr>
+      <w:r>
+        <w:t xml:space="preserve">2. Run an outer loop </w:t>
+      </w:r>
+      <w:proofErr w:type="spellStart"/>
+      <w:r>
+        <w:t>i</w:t>
+      </w:r>
+      <w:proofErr w:type="spellEnd"/>
+      <w:r>
+        <w:t xml:space="preserve"> from 0 to n-1 to choose the buying day.</w:t>
+      </w:r>
+    </w:p>
+    <w:p>
+      <w:pPr>
+        <w:pStyle w:val="NoSpacing"/>
+      </w:pPr>
+      <w:r>
+        <w:t>3. Run an inner loop j from i+1 to n-1 to choose the selling day.</w:t>
+      </w:r>
+    </w:p>
+    <w:p>
+      <w:pPr>
+        <w:pStyle w:val="NoSpacing"/>
+      </w:pPr>
+      <w:r>
+        <w:t xml:space="preserve">4. Calculate profit = </w:t>
+      </w:r>
+      <w:proofErr w:type="gramStart"/>
+      <w:r>
+        <w:t>max(</w:t>
+      </w:r>
+      <w:proofErr w:type="gramEnd"/>
+      <w:r>
+        <w:t>profit, prices[j] - prices[</w:t>
+      </w:r>
+      <w:proofErr w:type="spellStart"/>
+      <w:r>
+        <w:t>i</w:t>
+      </w:r>
+      <w:proofErr w:type="spellEnd"/>
+      <w:r>
+        <w:t>]).</w:t>
+      </w:r>
+    </w:p>
+    <w:p>
+      <w:pPr>
+        <w:pStyle w:val="NoSpacing"/>
+      </w:pPr>
+      <w:r>
+        <w:t>5. After checking all pairs, return the final profit.</w:t>
+      </w:r>
+    </w:p>
+    <w:p>
+      <w:pPr>
+        <w:pStyle w:val="NoSpacing"/>
+      </w:pPr>
+    </w:p>
+    <w:p>
+      <w:pPr>
+        <w:pStyle w:val="NoSpacing"/>
+      </w:pPr>
+    </w:p>
+    <w:tbl>
+      <w:tblPr>
+        <w:tblW w:w="13357" w:type="dxa"/>
+        <w:tblCellSpacing w:w="15" w:type="dxa"/>
+        <w:tblBorders>
+          <w:top w:val="single" w:sz="2" w:space="0" w:color="auto"/>
+          <w:left w:val="single" w:sz="2" w:space="0" w:color="auto"/>
+          <w:bottom w:val="single" w:sz="2" w:space="0" w:color="auto"/>
+          <w:right w:val="single" w:sz="2" w:space="0" w:color="auto"/>
+        </w:tblBorders>
+        <w:shd w:val="clear" w:color="auto" w:fill="1F2022"/>
+        <w:tblCellMar>
+          <w:left w:w="0" w:type="dxa"/>
+          <w:right w:w="0" w:type="dxa"/>
+        </w:tblCellMar>
+        <w:tblLook w:val="04A0" w:firstRow="1" w:lastRow="0" w:firstColumn="1" w:lastColumn="0" w:noHBand="0" w:noVBand="1"/>
+      </w:tblPr>
+      <w:tblGrid>
+        <w:gridCol w:w="6531"/>
+        <w:gridCol w:w="6826"/>
+      </w:tblGrid>
+      <w:tr>
+        <w:trPr>
+          <w:tblHeader/>
+          <w:tblCellSpacing w:w="15" w:type="dxa"/>
+        </w:trPr>
+        <w:tc>
+          <w:tcPr>
+            <w:tcW w:w="0" w:type="auto"/>
+            <w:tcBorders>
+              <w:top w:val="single" w:sz="6" w:space="0" w:color="313336"/>
+              <w:left w:val="single" w:sz="6" w:space="0" w:color="313336"/>
+              <w:bottom w:val="single" w:sz="6" w:space="0" w:color="313336"/>
+              <w:right w:val="single" w:sz="2" w:space="0" w:color="313336"/>
+            </w:tcBorders>
+            <w:shd w:val="clear" w:color="auto" w:fill="2B2C2E"/>
+            <w:tcMar>
+              <w:top w:w="120" w:type="dxa"/>
+              <w:left w:w="120" w:type="dxa"/>
+              <w:bottom w:w="120" w:type="dxa"/>
+              <w:right w:w="120" w:type="dxa"/>
+            </w:tcMar>
+            <w:vAlign w:val="center"/>
+            <w:hideMark/>
+          </w:tcPr>
+          <w:p>
+            <w:pPr>
+              <w:pStyle w:val="NoSpacing"/>
+              <w:rPr>
+                <w:b/>
+                <w:bCs/>
+              </w:rPr>
+            </w:pPr>
+            <w:r>
+              <w:rPr>
+                <w:b/>
+                <w:bCs/>
+              </w:rPr>
+              <w:t>Time Complexity</w:t>
+            </w:r>
+          </w:p>
+        </w:tc>
+        <w:tc>
+          <w:tcPr>
+            <w:tcW w:w="0" w:type="auto"/>
+            <w:tcBorders>
+              <w:top w:val="single" w:sz="6" w:space="0" w:color="313336"/>
+              <w:left w:val="single" w:sz="2" w:space="0" w:color="313336"/>
+              <w:bottom w:val="single" w:sz="6" w:space="0" w:color="313336"/>
+              <w:right w:val="single" w:sz="6" w:space="0" w:color="313336"/>
+            </w:tcBorders>
+            <w:shd w:val="clear" w:color="auto" w:fill="2B2C2E"/>
+            <w:tcMar>
+              <w:top w:w="120" w:type="dxa"/>
+              <w:left w:w="120" w:type="dxa"/>
+              <w:bottom w:w="120" w:type="dxa"/>
+              <w:right w:w="120" w:type="dxa"/>
+            </w:tcMar>
+            <w:vAlign w:val="center"/>
+            <w:hideMark/>
+          </w:tcPr>
+          <w:p>
+            <w:pPr>
+              <w:pStyle w:val="NoSpacing"/>
+              <w:rPr>
+                <w:b/>
+                <w:bCs/>
+              </w:rPr>
+            </w:pPr>
+            <w:r>
+              <w:rPr>
+                <w:b/>
+                <w:bCs/>
+              </w:rPr>
+              <w:t>Space Complexity</w:t>
+            </w:r>
+          </w:p>
+        </w:tc>
+      </w:tr>
+      <w:tr>
+        <w:trPr>
+          <w:tblCellSpacing w:w="15" w:type="dxa"/>
+        </w:trPr>
+        <w:tc>
+          <w:tcPr>
+            <w:tcW w:w="0" w:type="auto"/>
+            <w:tcBorders>
+              <w:top w:val="single" w:sz="2" w:space="0" w:color="auto"/>
+              <w:left w:val="single" w:sz="2" w:space="0" w:color="auto"/>
+              <w:bottom w:val="single" w:sz="2" w:space="0" w:color="auto"/>
+              <w:right w:val="single" w:sz="2" w:space="0" w:color="auto"/>
+            </w:tcBorders>
+            <w:shd w:val="clear" w:color="auto" w:fill="1F2022"/>
+            <w:tcMar>
+              <w:top w:w="180" w:type="dxa"/>
+              <w:left w:w="180" w:type="dxa"/>
+              <w:bottom w:w="180" w:type="dxa"/>
+              <w:right w:w="180" w:type="dxa"/>
+            </w:tcMar>
+            <w:vAlign w:val="center"/>
+            <w:hideMark/>
+          </w:tcPr>
+          <w:p>
+            <w:pPr>
+              <w:pStyle w:val="NoSpacing"/>
+            </w:pPr>
+            <w:r>
+              <w:t>O(n^2)</w:t>
+            </w:r>
+          </w:p>
+        </w:tc>
+        <w:tc>
+          <w:tcPr>
+            <w:tcW w:w="0" w:type="auto"/>
+            <w:tcBorders>
+              <w:top w:val="single" w:sz="2" w:space="0" w:color="auto"/>
+              <w:left w:val="single" w:sz="2" w:space="0" w:color="auto"/>
+              <w:bottom w:val="single" w:sz="2" w:space="0" w:color="auto"/>
+              <w:right w:val="single" w:sz="2" w:space="0" w:color="auto"/>
+            </w:tcBorders>
+            <w:shd w:val="clear" w:color="auto" w:fill="1F2022"/>
+            <w:tcMar>
+              <w:top w:w="180" w:type="dxa"/>
+              <w:left w:w="180" w:type="dxa"/>
+              <w:bottom w:w="180" w:type="dxa"/>
+              <w:right w:w="180" w:type="dxa"/>
+            </w:tcMar>
+            <w:vAlign w:val="center"/>
+            <w:hideMark/>
+          </w:tcPr>
+          <w:p>
+            <w:pPr>
+              <w:pStyle w:val="NoSpacing"/>
+            </w:pPr>
+            <w:proofErr w:type="gramStart"/>
+            <w:r>
+              <w:t>O(</w:t>
+            </w:r>
+            <w:proofErr w:type="gramEnd"/>
+            <w:r>
+              <w:t>1)</w:t>
+            </w:r>
+          </w:p>
+        </w:tc>
+      </w:tr>
+    </w:tbl>
+    <w:p>
+      <w:pPr>
+        <w:pStyle w:val="NoSpacing"/>
+      </w:pPr>
+    </w:p>
+    <w:p>
+      <w:pPr>
+        <w:pStyle w:val="NoSpacing"/>
+        <w:rPr>
+          <w:b/>
+          <w:bCs/>
+        </w:rPr>
+      </w:pPr>
+      <w:proofErr w:type="gramStart"/>
+      <w:r>
+        <w:rPr>
+          <w:b/>
+          <w:bCs/>
+        </w:rPr>
+        <w:t>Approach</w:t>
+      </w:r>
+      <w:r>
+        <w:rPr>
+          <w:b/>
+          <w:bCs/>
+        </w:rPr>
+        <w:t>(</w:t>
+      </w:r>
+      <w:proofErr w:type="gramEnd"/>
+      <w:r>
+        <w:rPr>
+          <w:b/>
+          <w:bCs/>
+        </w:rPr>
+        <w:t>Best)</w:t>
+      </w:r>
+    </w:p>
+    <w:p>
+      <w:pPr>
+        <w:pStyle w:val="NoSpacing"/>
+      </w:pPr>
+      <w:r>
+        <w:rPr>
+          <w:b/>
+          <w:bCs/>
+        </w:rPr>
+        <w:t xml:space="preserve">Single pass </w:t>
+      </w:r>
+      <w:proofErr w:type="gramStart"/>
+      <w:r>
+        <w:rPr>
+          <w:b/>
+          <w:bCs/>
+        </w:rPr>
+        <w:t>approach :</w:t>
+      </w:r>
+      <w:proofErr w:type="gramEnd"/>
+    </w:p>
+    <w:p>
+      <w:pPr>
+        <w:pStyle w:val="NoSpacing"/>
+      </w:pPr>
+    </w:p>
+    <w:p>
+      <w:pPr>
+        <w:pStyle w:val="NoSpacing"/>
+      </w:pPr>
+      <w:r>
+        <w:t>We track the lowest buying price and update the profit only when a better selling opportunity appears after it.</w:t>
+      </w:r>
+    </w:p>
+    <w:p>
+      <w:pPr>
+        <w:pStyle w:val="NoSpacing"/>
+      </w:pPr>
+    </w:p>
+    <w:p>
+      <w:pPr>
+        <w:pStyle w:val="NoSpacing"/>
+      </w:pPr>
+      <w:r>
+        <w:t xml:space="preserve">1. Initialize buy = </w:t>
+      </w:r>
+      <w:proofErr w:type="gramStart"/>
+      <w:r>
+        <w:t>prices[</w:t>
+      </w:r>
+      <w:proofErr w:type="gramEnd"/>
+      <w:r>
+        <w:t>0] and profit = 0 to track the best buying price and max profit.</w:t>
+      </w:r>
+    </w:p>
+    <w:p>
+      <w:pPr>
+        <w:pStyle w:val="NoSpacing"/>
+      </w:pPr>
+      <w:r>
+        <w:t>2. Since we already buy the stock at index 0 (the first day), we start traversing the array from index 1 (the second day) to index n - 1 (the last day) to evaluate each subsequent stock price. If prices[</w:t>
+      </w:r>
+      <w:proofErr w:type="spellStart"/>
+      <w:r>
+        <w:t>i</w:t>
+      </w:r>
+      <w:proofErr w:type="spellEnd"/>
+      <w:r>
+        <w:t>] &lt; buy, update buy with the lower price.</w:t>
+      </w:r>
+    </w:p>
+    <w:p>
+      <w:pPr>
+        <w:pStyle w:val="NoSpacing"/>
+      </w:pPr>
+      <w:r>
+        <w:t>3. Else if prices[</w:t>
+      </w:r>
+      <w:proofErr w:type="spellStart"/>
+      <w:r>
+        <w:t>i</w:t>
+      </w:r>
+      <w:proofErr w:type="spellEnd"/>
+      <w:r>
+        <w:t>] - buy &gt; profit, update profit with the new max profit.</w:t>
+      </w:r>
+    </w:p>
+    <w:p>
+      <w:pPr>
+        <w:pStyle w:val="NoSpacing"/>
+      </w:pPr>
+      <w:r>
+        <w:t>4. Continue this process to track the lowest buy and highest sell combination.</w:t>
+      </w:r>
+    </w:p>
+    <w:p>
+      <w:pPr>
+        <w:pStyle w:val="NoSpacing"/>
+      </w:pPr>
+      <w:r>
+        <w:t>5. Return the final profit, which holds the maximum achievable profit.</w:t>
+      </w:r>
+    </w:p>
+    <w:p>
+      <w:pPr>
+        <w:pStyle w:val="NoSpacing"/>
+      </w:pPr>
+    </w:p>
+    <w:p>
+      <w:pPr>
+        <w:pStyle w:val="NoSpacing"/>
+      </w:pPr>
+      <w:r>
+        <w:rPr>
+          <w:b/>
+          <w:bCs/>
+        </w:rPr>
+        <w:t>Dry Run</w:t>
+      </w:r>
+    </w:p>
+    <w:p>
+      <w:pPr>
+        <w:pStyle w:val="NoSpacing"/>
+      </w:pPr>
+      <w:r>
+        <w:t>Input: prices = [7, 1, 5, 3, 6, 4]</w:t>
+      </w:r>
+    </w:p>
+    <w:p>
+      <w:pPr>
+        <w:pStyle w:val="NoSpacing"/>
+      </w:pPr>
+      <w:r>
+        <w:t xml:space="preserve">Initialization: Buy = </w:t>
+      </w:r>
+      <w:proofErr w:type="gramStart"/>
+      <w:r>
+        <w:t>prices[</w:t>
+      </w:r>
+      <w:proofErr w:type="gramEnd"/>
+      <w:r>
+        <w:t>0</w:t>
+      </w:r>
+      <w:proofErr w:type="gramStart"/>
+      <w:r>
+        <w:t>] ,</w:t>
+      </w:r>
+      <w:proofErr w:type="gramEnd"/>
+      <w:r>
+        <w:t xml:space="preserve"> Profit = 0</w:t>
+      </w:r>
+    </w:p>
+    <w:p>
+      <w:pPr>
+        <w:pStyle w:val="NoSpacing"/>
+      </w:pPr>
+      <w:r>
+        <w:t>Result:</w:t>
+      </w:r>
+    </w:p>
+    <w:p>
+      <w:pPr>
+        <w:pStyle w:val="NoSpacing"/>
+        <w:numPr>
+          <w:ilvl w:val="0"/>
+          <w:numId w:val="9"/>
+        </w:numPr>
+      </w:pPr>
+      <w:r>
+        <w:t>Buy on Day 1 at Price = 1</w:t>
+      </w:r>
+    </w:p>
+    <w:p>
+      <w:pPr>
+        <w:pStyle w:val="NoSpacing"/>
+        <w:numPr>
+          <w:ilvl w:val="0"/>
+          <w:numId w:val="9"/>
+        </w:numPr>
+      </w:pPr>
+      <w:r>
+        <w:t>Sell on Day 4 at Price = 6</w:t>
+      </w:r>
+    </w:p>
+    <w:p>
+      <w:pPr>
+        <w:pStyle w:val="NoSpacing"/>
+        <w:numPr>
+          <w:ilvl w:val="0"/>
+          <w:numId w:val="9"/>
+        </w:numPr>
+      </w:pPr>
+      <w:r>
+        <w:t>Profit = 6 - 1 = 5</w:t>
+      </w:r>
+    </w:p>
+    <w:p>
+      <w:pPr>
+        <w:pStyle w:val="NoSpacing"/>
+      </w:pPr>
+    </w:p>
+    <w:tbl>
+      <w:tblPr>
+        <w:tblW w:w="13357" w:type="dxa"/>
+        <w:tblCellSpacing w:w="15" w:type="dxa"/>
+        <w:tblBorders>
+          <w:top w:val="single" w:sz="2" w:space="0" w:color="auto"/>
+          <w:left w:val="single" w:sz="2" w:space="0" w:color="auto"/>
+          <w:bottom w:val="single" w:sz="2" w:space="0" w:color="auto"/>
+          <w:right w:val="single" w:sz="2" w:space="0" w:color="auto"/>
+        </w:tblBorders>
+        <w:shd w:val="clear" w:color="auto" w:fill="1F2022"/>
+        <w:tblCellMar>
+          <w:left w:w="0" w:type="dxa"/>
+          <w:right w:w="0" w:type="dxa"/>
+        </w:tblCellMar>
+        <w:tblLook w:val="04A0" w:firstRow="1" w:lastRow="0" w:firstColumn="1" w:lastColumn="0" w:noHBand="0" w:noVBand="1"/>
+      </w:tblPr>
+      <w:tblGrid>
+        <w:gridCol w:w="6531"/>
+        <w:gridCol w:w="6826"/>
+      </w:tblGrid>
+      <w:tr>
+        <w:trPr>
+          <w:tblHeader/>
+          <w:tblCellSpacing w:w="15" w:type="dxa"/>
+        </w:trPr>
+        <w:tc>
+          <w:tcPr>
+            <w:tcW w:w="0" w:type="auto"/>
+            <w:tcBorders>
+              <w:top w:val="single" w:sz="6" w:space="0" w:color="313336"/>
+              <w:left w:val="single" w:sz="6" w:space="0" w:color="313336"/>
+              <w:bottom w:val="single" w:sz="6" w:space="0" w:color="313336"/>
+              <w:right w:val="single" w:sz="2" w:space="0" w:color="313336"/>
+            </w:tcBorders>
+            <w:shd w:val="clear" w:color="auto" w:fill="2B2C2E"/>
+            <w:tcMar>
+              <w:top w:w="120" w:type="dxa"/>
+              <w:left w:w="120" w:type="dxa"/>
+              <w:bottom w:w="120" w:type="dxa"/>
+              <w:right w:w="120" w:type="dxa"/>
+            </w:tcMar>
+            <w:vAlign w:val="center"/>
+            <w:hideMark/>
+          </w:tcPr>
+          <w:p>
+            <w:pPr>
+              <w:pStyle w:val="NoSpacing"/>
+              <w:rPr>
+                <w:b/>
+                <w:bCs/>
+              </w:rPr>
+            </w:pPr>
+            <w:r>
+              <w:rPr>
+                <w:b/>
+                <w:bCs/>
+              </w:rPr>
+              <w:t>Time Complexity</w:t>
+            </w:r>
+          </w:p>
+        </w:tc>
+        <w:tc>
+          <w:tcPr>
+            <w:tcW w:w="0" w:type="auto"/>
+            <w:tcBorders>
+              <w:top w:val="single" w:sz="6" w:space="0" w:color="313336"/>
+              <w:left w:val="single" w:sz="2" w:space="0" w:color="313336"/>
+              <w:bottom w:val="single" w:sz="6" w:space="0" w:color="313336"/>
+              <w:right w:val="single" w:sz="6" w:space="0" w:color="313336"/>
+            </w:tcBorders>
+            <w:shd w:val="clear" w:color="auto" w:fill="2B2C2E"/>
+            <w:tcMar>
+              <w:top w:w="120" w:type="dxa"/>
+              <w:left w:w="120" w:type="dxa"/>
+              <w:bottom w:w="120" w:type="dxa"/>
+              <w:right w:w="120" w:type="dxa"/>
+            </w:tcMar>
+            <w:vAlign w:val="center"/>
+            <w:hideMark/>
+          </w:tcPr>
+          <w:p>
+            <w:pPr>
+              <w:pStyle w:val="NoSpacing"/>
+              <w:rPr>
+                <w:b/>
+                <w:bCs/>
+              </w:rPr>
+            </w:pPr>
+            <w:r>
+              <w:rPr>
+                <w:b/>
+                <w:bCs/>
+              </w:rPr>
+              <w:t>Space Complexity</w:t>
+            </w:r>
+          </w:p>
+        </w:tc>
+      </w:tr>
+      <w:tr>
+        <w:trPr>
+          <w:tblCellSpacing w:w="15" w:type="dxa"/>
+        </w:trPr>
+        <w:tc>
+          <w:tcPr>
+            <w:tcW w:w="0" w:type="auto"/>
+            <w:tcBorders>
+              <w:top w:val="single" w:sz="2" w:space="0" w:color="auto"/>
+              <w:left w:val="single" w:sz="2" w:space="0" w:color="auto"/>
+              <w:bottom w:val="single" w:sz="2" w:space="0" w:color="auto"/>
+              <w:right w:val="single" w:sz="2" w:space="0" w:color="auto"/>
+            </w:tcBorders>
+            <w:shd w:val="clear" w:color="auto" w:fill="1F2022"/>
+            <w:tcMar>
+              <w:top w:w="180" w:type="dxa"/>
+              <w:left w:w="180" w:type="dxa"/>
+              <w:bottom w:w="180" w:type="dxa"/>
+              <w:right w:w="180" w:type="dxa"/>
+            </w:tcMar>
+            <w:vAlign w:val="center"/>
+            <w:hideMark/>
+          </w:tcPr>
+          <w:p>
+            <w:pPr>
+              <w:pStyle w:val="NoSpacing"/>
+            </w:pPr>
+            <w:r>
+              <w:t>O(n) </w:t>
+            </w:r>
+          </w:p>
+        </w:tc>
+        <w:tc>
+          <w:tcPr>
+            <w:tcW w:w="0" w:type="auto"/>
+            <w:tcBorders>
+              <w:top w:val="single" w:sz="2" w:space="0" w:color="auto"/>
+              <w:left w:val="single" w:sz="2" w:space="0" w:color="auto"/>
+              <w:bottom w:val="single" w:sz="2" w:space="0" w:color="auto"/>
+              <w:right w:val="single" w:sz="2" w:space="0" w:color="auto"/>
+            </w:tcBorders>
+            <w:shd w:val="clear" w:color="auto" w:fill="1F2022"/>
+            <w:tcMar>
+              <w:top w:w="180" w:type="dxa"/>
+              <w:left w:w="180" w:type="dxa"/>
+              <w:bottom w:w="180" w:type="dxa"/>
+              <w:right w:w="180" w:type="dxa"/>
+            </w:tcMar>
+            <w:vAlign w:val="center"/>
+            <w:hideMark/>
+          </w:tcPr>
+          <w:p>
+            <w:pPr>
+              <w:pStyle w:val="NoSpacing"/>
+            </w:pPr>
+            <w:proofErr w:type="gramStart"/>
+            <w:r>
+              <w:t>O(</w:t>
+            </w:r>
+            <w:proofErr w:type="gramEnd"/>
+            <w:r>
+              <w:t>1)</w:t>
+            </w:r>
+          </w:p>
+        </w:tc>
+      </w:tr>
+    </w:tbl>
+    <w:p>
+      <w:pPr>
+        <w:pStyle w:val="NoSpacing"/>
+      </w:pPr>
+    </w:p>
+    <w:p>
+      <w:pPr>
+        <w:pStyle w:val="NoSpacing"/>
+      </w:pPr>
+    </w:p>
+    <w:p>
+      <w:pPr>
+        <w:pStyle w:val="NoSpacing"/>
+      </w:pPr>
+    </w:p>
+    <w:p>
+      <w:pPr>
+        <w:pStyle w:val="NoSpacing"/>
+      </w:pPr>
+    </w:p>
+    <w:p>
+      <w:pPr>
+        <w:pStyle w:val="NoSpacing"/>
+      </w:pPr>
+    </w:p>
     <w:p/>
     <w:p/>
     <w:sectPr>
@@ -3555,6 +4428,155 @@
     </w:lvl>
   </w:abstractNum>
   <w:abstractNum w:abstractNumId="2" w15:restartNumberingAfterBreak="0">
+    <w:nsid w:val="1AB94F04"/>
+    <w:multiLevelType w:val="multilevel"/>
+    <w:tmpl w:val="3858D5FC"/>
+    <w:lvl w:ilvl="0">
+      <w:start w:val="1"/>
+      <w:numFmt w:val="bullet"/>
+      <w:lvlText w:val=""/>
+      <w:lvlJc w:val="left"/>
+      <w:pPr>
+        <w:tabs>
+          <w:tab w:val="num" w:pos="720"/>
+        </w:tabs>
+        <w:ind w:left="720" w:hanging="360"/>
+      </w:pPr>
+      <w:rPr>
+        <w:rFonts w:ascii="Symbol" w:hAnsi="Symbol" w:hint="default"/>
+        <w:sz w:val="20"/>
+      </w:rPr>
+    </w:lvl>
+    <w:lvl w:ilvl="1" w:tentative="1">
+      <w:start w:val="1"/>
+      <w:numFmt w:val="bullet"/>
+      <w:lvlText w:val=""/>
+      <w:lvlJc w:val="left"/>
+      <w:pPr>
+        <w:tabs>
+          <w:tab w:val="num" w:pos="1440"/>
+        </w:tabs>
+        <w:ind w:left="1440" w:hanging="360"/>
+      </w:pPr>
+      <w:rPr>
+        <w:rFonts w:ascii="Symbol" w:hAnsi="Symbol" w:hint="default"/>
+        <w:sz w:val="20"/>
+      </w:rPr>
+    </w:lvl>
+    <w:lvl w:ilvl="2" w:tentative="1">
+      <w:start w:val="1"/>
+      <w:numFmt w:val="bullet"/>
+      <w:lvlText w:val=""/>
+      <w:lvlJc w:val="left"/>
+      <w:pPr>
+        <w:tabs>
+          <w:tab w:val="num" w:pos="2160"/>
+        </w:tabs>
+        <w:ind w:left="2160" w:hanging="360"/>
+      </w:pPr>
+      <w:rPr>
+        <w:rFonts w:ascii="Symbol" w:hAnsi="Symbol" w:hint="default"/>
+        <w:sz w:val="20"/>
+      </w:rPr>
+    </w:lvl>
+    <w:lvl w:ilvl="3" w:tentative="1">
+      <w:start w:val="1"/>
+      <w:numFmt w:val="bullet"/>
+      <w:lvlText w:val=""/>
+      <w:lvlJc w:val="left"/>
+      <w:pPr>
+        <w:tabs>
+          <w:tab w:val="num" w:pos="2880"/>
+        </w:tabs>
+        <w:ind w:left="2880" w:hanging="360"/>
+      </w:pPr>
+      <w:rPr>
+        <w:rFonts w:ascii="Symbol" w:hAnsi="Symbol" w:hint="default"/>
+        <w:sz w:val="20"/>
+      </w:rPr>
+    </w:lvl>
+    <w:lvl w:ilvl="4" w:tentative="1">
+      <w:start w:val="1"/>
+      <w:numFmt w:val="bullet"/>
+      <w:lvlText w:val=""/>
+      <w:lvlJc w:val="left"/>
+      <w:pPr>
+        <w:tabs>
+          <w:tab w:val="num" w:pos="3600"/>
+        </w:tabs>
+        <w:ind w:left="3600" w:hanging="360"/>
+      </w:pPr>
+      <w:rPr>
+        <w:rFonts w:ascii="Symbol" w:hAnsi="Symbol" w:hint="default"/>
+        <w:sz w:val="20"/>
+      </w:rPr>
+    </w:lvl>
+    <w:lvl w:ilvl="5" w:tentative="1">
+      <w:start w:val="1"/>
+      <w:numFmt w:val="bullet"/>
+      <w:lvlText w:val=""/>
+      <w:lvlJc w:val="left"/>
+      <w:pPr>
+        <w:tabs>
+          <w:tab w:val="num" w:pos="4320"/>
+        </w:tabs>
+        <w:ind w:left="4320" w:hanging="360"/>
+      </w:pPr>
+      <w:rPr>
+        <w:rFonts w:ascii="Symbol" w:hAnsi="Symbol" w:hint="default"/>
+        <w:sz w:val="20"/>
+      </w:rPr>
+    </w:lvl>
+    <w:lvl w:ilvl="6" w:tentative="1">
+      <w:start w:val="1"/>
+      <w:numFmt w:val="bullet"/>
+      <w:lvlText w:val=""/>
+      <w:lvlJc w:val="left"/>
+      <w:pPr>
+        <w:tabs>
+          <w:tab w:val="num" w:pos="5040"/>
+        </w:tabs>
+        <w:ind w:left="5040" w:hanging="360"/>
+      </w:pPr>
+      <w:rPr>
+        <w:rFonts w:ascii="Symbol" w:hAnsi="Symbol" w:hint="default"/>
+        <w:sz w:val="20"/>
+      </w:rPr>
+    </w:lvl>
+    <w:lvl w:ilvl="7" w:tentative="1">
+      <w:start w:val="1"/>
+      <w:numFmt w:val="bullet"/>
+      <w:lvlText w:val=""/>
+      <w:lvlJc w:val="left"/>
+      <w:pPr>
+        <w:tabs>
+          <w:tab w:val="num" w:pos="5760"/>
+        </w:tabs>
+        <w:ind w:left="5760" w:hanging="360"/>
+      </w:pPr>
+      <w:rPr>
+        <w:rFonts w:ascii="Symbol" w:hAnsi="Symbol" w:hint="default"/>
+        <w:sz w:val="20"/>
+      </w:rPr>
+    </w:lvl>
+    <w:lvl w:ilvl="8" w:tentative="1">
+      <w:start w:val="1"/>
+      <w:numFmt w:val="bullet"/>
+      <w:lvlText w:val=""/>
+      <w:lvlJc w:val="left"/>
+      <w:pPr>
+        <w:tabs>
+          <w:tab w:val="num" w:pos="6480"/>
+        </w:tabs>
+        <w:ind w:left="6480" w:hanging="360"/>
+      </w:pPr>
+      <w:rPr>
+        <w:rFonts w:ascii="Symbol" w:hAnsi="Symbol" w:hint="default"/>
+        <w:sz w:val="20"/>
+      </w:rPr>
+    </w:lvl>
+  </w:abstractNum>
+  <w:abstractNum w:abstractNumId="3" w15:restartNumberingAfterBreak="0">
     <w:nsid w:val="1BAB34BD"/>
     <w:multiLevelType w:val="multilevel"/>
     <w:tmpl w:val="C7A6D49E"/>
@@ -3703,7 +4725,7 @@
       </w:rPr>
     </w:lvl>
   </w:abstractNum>
-  <w:abstractNum w:abstractNumId="3" w15:restartNumberingAfterBreak="0">
+  <w:abstractNum w:abstractNumId="4" w15:restartNumberingAfterBreak="0">
     <w:nsid w:val="42823EE6"/>
     <w:multiLevelType w:val="multilevel"/>
     <w:tmpl w:val="8EE8D394"/>
@@ -3852,7 +4874,7 @@
       </w:rPr>
     </w:lvl>
   </w:abstractNum>
-  <w:abstractNum w:abstractNumId="4" w15:restartNumberingAfterBreak="0">
+  <w:abstractNum w:abstractNumId="5" w15:restartNumberingAfterBreak="0">
     <w:nsid w:val="4F3E539F"/>
     <w:multiLevelType w:val="multilevel"/>
     <w:tmpl w:val="8382A780"/>
@@ -4001,7 +5023,7 @@
       </w:rPr>
     </w:lvl>
   </w:abstractNum>
-  <w:abstractNum w:abstractNumId="5" w15:restartNumberingAfterBreak="0">
+  <w:abstractNum w:abstractNumId="6" w15:restartNumberingAfterBreak="0">
     <w:nsid w:val="4F843E15"/>
     <w:multiLevelType w:val="multilevel"/>
     <w:tmpl w:val="E6D879DC"/>
@@ -4150,7 +5172,7 @@
       </w:rPr>
     </w:lvl>
   </w:abstractNum>
-  <w:abstractNum w:abstractNumId="6" w15:restartNumberingAfterBreak="0">
+  <w:abstractNum w:abstractNumId="7" w15:restartNumberingAfterBreak="0">
     <w:nsid w:val="544A7336"/>
     <w:multiLevelType w:val="multilevel"/>
     <w:tmpl w:val="754A0798"/>
@@ -4299,7 +5321,7 @@
       </w:rPr>
     </w:lvl>
   </w:abstractNum>
-  <w:abstractNum w:abstractNumId="7" w15:restartNumberingAfterBreak="0">
+  <w:abstractNum w:abstractNumId="8" w15:restartNumberingAfterBreak="0">
     <w:nsid w:val="764F176E"/>
     <w:multiLevelType w:val="multilevel"/>
     <w:tmpl w:val="3530BD80"/>
@@ -4452,24 +5474,27 @@
     <w:abstractNumId w:val="1"/>
   </w:num>
   <w:num w:numId="2" w16cid:durableId="1049644441">
-    <w:abstractNumId w:val="3"/>
+    <w:abstractNumId w:val="4"/>
   </w:num>
   <w:num w:numId="3" w16cid:durableId="855195527">
-    <w:abstractNumId w:val="4"/>
+    <w:abstractNumId w:val="5"/>
   </w:num>
   <w:num w:numId="4" w16cid:durableId="1456169704">
-    <w:abstractNumId w:val="6"/>
+    <w:abstractNumId w:val="7"/>
   </w:num>
   <w:num w:numId="5" w16cid:durableId="613444548">
-    <w:abstractNumId w:val="7"/>
+    <w:abstractNumId w:val="8"/>
   </w:num>
   <w:num w:numId="6" w16cid:durableId="269171363">
     <w:abstractNumId w:val="0"/>
   </w:num>
   <w:num w:numId="7" w16cid:durableId="920456329">
-    <w:abstractNumId w:val="5"/>
+    <w:abstractNumId w:val="6"/>
   </w:num>
   <w:num w:numId="8" w16cid:durableId="811756253">
+    <w:abstractNumId w:val="3"/>
+  </w:num>
+  <w:num w:numId="9" w16cid:durableId="1310598230">
     <w:abstractNumId w:val="2"/>
   </w:num>
 </w:numbering>

</xml_diff>

<commit_message>
11)container with most water --> done
</commit_message>
<xml_diff>
--- a/Apna college sheet DSA/Array/Self Notes.docx
+++ b/Apna college sheet DSA/Array/Self Notes.docx
@@ -1,6 +1,6 @@
 
 <file path=word/document.xml><?xml version="1.0" encoding="utf-8"?>
-<w:document xmlns:wpc="http://schemas.microsoft.com/office/word/2010/wordprocessingCanvas" xmlns:cx="http://schemas.microsoft.com/office/drawing/2014/chartex" xmlns:cx1="http://schemas.microsoft.com/office/drawing/2015/9/8/chartex" xmlns:cx2="http://schemas.microsoft.com/office/drawing/2015/10/21/chartex" xmlns:cx3="http://schemas.microsoft.com/office/drawing/2016/5/9/chartex" xmlns:cx4="http://schemas.microsoft.com/office/drawing/2016/5/10/chartex" xmlns:cx5="http://schemas.microsoft.com/office/drawing/2016/5/11/chartex" xmlns:cx6="http://schemas.microsoft.com/office/drawing/2016/5/12/chartex" xmlns:cx7="http://schemas.microsoft.com/office/drawing/2016/5/13/chartex" xmlns:cx8="http://schemas.microsoft.com/office/drawing/2016/5/14/chartex" xmlns:mc="http://schemas.openxmlformats.org/markup-compatibility/2006" xmlns:aink="http://schemas.microsoft.com/office/drawing/2016/ink" xmlns:am3d="http://schemas.microsoft.com/office/drawing/2017/model3d" xmlns:o="urn:schemas-microsoft-com:office:office" xmlns:oel="http://schemas.microsoft.com/office/2019/extlst" xmlns:r="http://schemas.openxmlformats.org/officeDocument/2006/relationships" xmlns:m="http://schemas.openxmlformats.org/officeDocument/2006/math" xmlns:v="urn:schemas-microsoft-com:vml" xmlns:wp14="http://schemas.microsoft.com/office/word/2010/wordprocessingDrawing" xmlns:wp="http://schemas.openxmlformats.org/drawingml/2006/wordprocessingDrawing" xmlns:w10="urn:schemas-microsoft-com:office:word" xmlns:w="http://schemas.openxmlformats.org/wordprocessingml/2006/main" xmlns:w14="http://schemas.microsoft.com/office/word/2010/wordml" xmlns:w15="http://schemas.microsoft.com/office/word/2012/wordml" xmlns:w16cex="http://schemas.microsoft.com/office/word/2018/wordml/cex" xmlns:w16cid="http://schemas.microsoft.com/office/word/2016/wordml/cid" xmlns:w16="http://schemas.microsoft.com/office/word/2018/wordml" xmlns:w16du="http://schemas.microsoft.com/office/word/2023/wordml/word16du" xmlns:w16sdtdh="http://schemas.microsoft.com/office/word/2020/wordml/sdtdatahash" xmlns:w16sdtfl="http://schemas.microsoft.com/office/word/2024/wordml/sdtformatlock" xmlns:w16se="http://schemas.microsoft.com/office/word/2015/wordml/symex" xmlns:wpg="http://schemas.microsoft.com/office/word/2010/wordprocessingGroup" xmlns:wpi="http://schemas.microsoft.com/office/word/2010/wordprocessingInk" xmlns:wne="http://schemas.microsoft.com/office/word/2006/wordml" xmlns:wps="http://schemas.microsoft.com/office/word/2010/wordprocessingShape" mc:Ignorable="w14 w15 w16se w16cid w16 w16cex w16sdtdh w16sdtfl w16du wp14">
+<w:document xmlns:wpc="http://schemas.microsoft.com/office/word/2010/wordprocessingCanvas" xmlns:cx="http://schemas.microsoft.com/office/drawing/2014/chartex" xmlns:cx1="http://schemas.microsoft.com/office/drawing/2015/9/8/chartex" xmlns:cx2="http://schemas.microsoft.com/office/drawing/2015/10/21/chartex" xmlns:cx3="http://schemas.microsoft.com/office/drawing/2016/5/9/chartex" xmlns:cx4="http://schemas.microsoft.com/office/drawing/2016/5/10/chartex" xmlns:cx5="http://schemas.microsoft.com/office/drawing/2016/5/11/chartex" xmlns:cx6="http://schemas.microsoft.com/office/drawing/2016/5/12/chartex" xmlns:cx7="http://schemas.microsoft.com/office/drawing/2016/5/13/chartex" xmlns:cx8="http://schemas.microsoft.com/office/drawing/2016/5/14/chartex" xmlns:mc="http://schemas.openxmlformats.org/markup-compatibility/2006" xmlns:aink="http://schemas.microsoft.com/office/drawing/2016/ink" xmlns:am3d="http://schemas.microsoft.com/office/drawing/2017/model3d" xmlns:o="urn:schemas-microsoft-com:office:office" xmlns:oel="http://schemas.microsoft.com/office/2019/extlst" xmlns:r="http://schemas.openxmlformats.org/officeDocument/2006/relationships" xmlns:m="http://schemas.openxmlformats.org/officeDocument/2006/math" xmlns:v="urn:schemas-microsoft-com:vml" xmlns:wp14="http://schemas.microsoft.com/office/word/2010/wordprocessingDrawing" xmlns:wp="http://schemas.openxmlformats.org/drawingml/2006/wordprocessingDrawing" xmlns:w10="urn:schemas-microsoft-com:office:word" xmlns:w="http://schemas.openxmlformats.org/wordprocessingml/2006/main" xmlns:w14="http://schemas.microsoft.com/office/word/2010/wordml" xmlns:w15="http://schemas.microsoft.com/office/word/2012/wordml" xmlns:w16cei="http://schemas.microsoft.com/office/word/2026/wordml/cei" xmlns:w16cex="http://schemas.microsoft.com/office/word/2018/wordml/cex" xmlns:w16cid="http://schemas.microsoft.com/office/word/2016/wordml/cid" xmlns:w16="http://schemas.microsoft.com/office/word/2018/wordml" xmlns:w16du="http://schemas.microsoft.com/office/word/2023/wordml/word16du" xmlns:w16sdtdh="http://schemas.microsoft.com/office/word/2020/wordml/sdtdatahash" xmlns:w16sdtfl="http://schemas.microsoft.com/office/word/2024/wordml/sdtformatlock" xmlns:w16se="http://schemas.microsoft.com/office/word/2015/wordml/symex" xmlns:wpg="http://schemas.microsoft.com/office/word/2010/wordprocessingGroup" xmlns:wpi="http://schemas.microsoft.com/office/word/2010/wordprocessingInk" xmlns:wne="http://schemas.microsoft.com/office/word/2006/wordml" xmlns:wps="http://schemas.microsoft.com/office/word/2010/wordprocessingShape" mc:Ignorable="w14 w15 w16se w16cid w16 w16cex w16sdtdh w16sdtfl w16du wp14">
   <w:body>
     <w:p>
       <w:pPr>
@@ -5824,30 +5824,14 @@
           <w:sz w:val="26"/>
           <w:szCs w:val="26"/>
         </w:rPr>
-        <w:t xml:space="preserve">Problem </w:t>
-      </w:r>
-      <w:r>
-        <w:rPr>
-          <w:b/>
-          <w:bCs/>
-          <w:sz w:val="26"/>
-          <w:szCs w:val="26"/>
-        </w:rPr>
-        <w:t>Statement:</w:t>
-      </w:r>
-      <w:r>
-        <w:rPr>
-          <w:sz w:val="26"/>
-          <w:szCs w:val="26"/>
-        </w:rPr>
-        <w:t xml:space="preserve"> Given</w:t>
-      </w:r>
-      <w:r>
-        <w:rPr>
-          <w:sz w:val="26"/>
-          <w:szCs w:val="26"/>
-        </w:rPr>
-        <w:t xml:space="preserve"> an integer array </w:t>
+        <w:t>Problem Statement:</w:t>
+      </w:r>
+      <w:r>
+        <w:rPr>
+          <w:sz w:val="26"/>
+          <w:szCs w:val="26"/>
+        </w:rPr>
+        <w:t xml:space="preserve"> Given an integer array </w:t>
       </w:r>
       <w:proofErr w:type="spellStart"/>
       <w:r>
@@ -8086,6 +8070,684 @@
         </w:rPr>
       </w:pPr>
     </w:p>
+    <w:p>
+      <w:pPr>
+        <w:rPr>
+          <w:sz w:val="26"/>
+          <w:szCs w:val="26"/>
+        </w:rPr>
+      </w:pPr>
+    </w:p>
+    <w:p>
+      <w:pPr>
+        <w:rPr>
+          <w:sz w:val="26"/>
+          <w:szCs w:val="26"/>
+        </w:rPr>
+      </w:pPr>
+    </w:p>
+    <w:p>
+      <w:pPr>
+        <w:rPr>
+          <w:sz w:val="26"/>
+          <w:szCs w:val="26"/>
+        </w:rPr>
+      </w:pPr>
+    </w:p>
+    <w:p>
+      <w:pPr>
+        <w:rPr>
+          <w:sz w:val="26"/>
+          <w:szCs w:val="26"/>
+        </w:rPr>
+      </w:pPr>
+    </w:p>
+    <w:p>
+      <w:pPr>
+        <w:rPr>
+          <w:sz w:val="26"/>
+          <w:szCs w:val="26"/>
+        </w:rPr>
+      </w:pPr>
+    </w:p>
+    <w:p>
+      <w:pPr>
+        <w:rPr>
+          <w:b/>
+          <w:bCs/>
+          <w:sz w:val="40"/>
+          <w:szCs w:val="40"/>
+          <w:u w:val="single"/>
+        </w:rPr>
+      </w:pPr>
+      <w:r>
+        <w:rPr>
+          <w:b/>
+          <w:bCs/>
+          <w:sz w:val="40"/>
+          <w:szCs w:val="40"/>
+          <w:u w:val="single"/>
+        </w:rPr>
+        <w:t>11)</w:t>
+      </w:r>
+      <w:r>
+        <w:rPr>
+          <w:b/>
+          <w:bCs/>
+          <w:sz w:val="40"/>
+          <w:szCs w:val="40"/>
+          <w:u w:val="single"/>
+        </w:rPr>
+        <w:t>Container with most water</w:t>
+      </w:r>
+    </w:p>
+    <w:p>
+      <w:r>
+        <w:rPr>
+          <w:b/>
+          <w:bCs/>
+        </w:rPr>
+        <w:t xml:space="preserve">Problem </w:t>
+      </w:r>
+      <w:proofErr w:type="gramStart"/>
+      <w:r>
+        <w:rPr>
+          <w:b/>
+          <w:bCs/>
+        </w:rPr>
+        <w:t>Statement :</w:t>
+      </w:r>
+      <w:r>
+        <w:t>You</w:t>
+      </w:r>
+      <w:proofErr w:type="gramEnd"/>
+      <w:r>
+        <w:t xml:space="preserve"> are given an integer array </w:t>
+      </w:r>
+      <w:r>
+        <w:rPr>
+          <w:b/>
+          <w:bCs/>
+        </w:rPr>
+        <w:t>height</w:t>
+      </w:r>
+      <w:r>
+        <w:t> of length </w:t>
+      </w:r>
+      <w:r>
+        <w:rPr>
+          <w:b/>
+          <w:bCs/>
+        </w:rPr>
+        <w:t>n</w:t>
+      </w:r>
+      <w:r>
+        <w:t>. There are </w:t>
+      </w:r>
+      <w:r>
+        <w:rPr>
+          <w:b/>
+          <w:bCs/>
+        </w:rPr>
+        <w:t>n</w:t>
+      </w:r>
+      <w:r>
+        <w:t> vertical lines drawn such that the two endpoints of the </w:t>
+      </w:r>
+      <w:proofErr w:type="spellStart"/>
+      <w:r>
+        <w:rPr>
+          <w:b/>
+          <w:bCs/>
+        </w:rPr>
+        <w:t>i</w:t>
+      </w:r>
+      <w:proofErr w:type="spellEnd"/>
+      <w:r>
+        <w:rPr>
+          <w:b/>
+          <w:bCs/>
+        </w:rPr>
+        <w:t xml:space="preserve"> </w:t>
+      </w:r>
+      <w:proofErr w:type="spellStart"/>
+      <w:r>
+        <w:rPr>
+          <w:b/>
+          <w:bCs/>
+        </w:rPr>
+        <w:t>th</w:t>
+      </w:r>
+      <w:proofErr w:type="spellEnd"/>
+      <w:r>
+        <w:t> line are </w:t>
+      </w:r>
+      <w:r>
+        <w:rPr>
+          <w:b/>
+          <w:bCs/>
+        </w:rPr>
+        <w:t>(</w:t>
+      </w:r>
+      <w:proofErr w:type="spellStart"/>
+      <w:r>
+        <w:rPr>
+          <w:b/>
+          <w:bCs/>
+        </w:rPr>
+        <w:t>i</w:t>
+      </w:r>
+      <w:proofErr w:type="spellEnd"/>
+      <w:r>
+        <w:rPr>
+          <w:b/>
+          <w:bCs/>
+        </w:rPr>
+        <w:t>, 0)</w:t>
+      </w:r>
+      <w:r>
+        <w:t> and </w:t>
+      </w:r>
+      <w:r>
+        <w:rPr>
+          <w:b/>
+          <w:bCs/>
+        </w:rPr>
+        <w:t>(</w:t>
+      </w:r>
+      <w:proofErr w:type="spellStart"/>
+      <w:r>
+        <w:rPr>
+          <w:b/>
+          <w:bCs/>
+        </w:rPr>
+        <w:t>i</w:t>
+      </w:r>
+      <w:proofErr w:type="spellEnd"/>
+      <w:r>
+        <w:rPr>
+          <w:b/>
+          <w:bCs/>
+        </w:rPr>
+        <w:t>, height[</w:t>
+      </w:r>
+      <w:proofErr w:type="spellStart"/>
+      <w:r>
+        <w:rPr>
+          <w:b/>
+          <w:bCs/>
+        </w:rPr>
+        <w:t>i</w:t>
+      </w:r>
+      <w:proofErr w:type="spellEnd"/>
+      <w:r>
+        <w:rPr>
+          <w:b/>
+          <w:bCs/>
+        </w:rPr>
+        <w:t>])</w:t>
+      </w:r>
+      <w:r>
+        <w:t>.</w:t>
+      </w:r>
+    </w:p>
+    <w:p>
+      <w:r>
+        <w:t>Find two lines that together with the x-axis form a container, such that the container contains the most water.</w:t>
+      </w:r>
+    </w:p>
+    <w:p>
+      <w:r>
+        <w:t>Return the maximum amount of water a container can store.</w:t>
+      </w:r>
+    </w:p>
+    <w:p>
+      <w:proofErr w:type="gramStart"/>
+      <w:r>
+        <w:rPr>
+          <w:b/>
+          <w:bCs/>
+        </w:rPr>
+        <w:t>Example :</w:t>
+      </w:r>
+      <w:proofErr w:type="gramEnd"/>
+      <w:r>
+        <w:rPr>
+          <w:b/>
+          <w:bCs/>
+        </w:rPr>
+        <w:t xml:space="preserve"> Stick Height</w:t>
+      </w:r>
+    </w:p>
+    <w:p>
+      <w:r>
+        <w:t>Arjun saw that water collected between wooden sticks of different sizes. He wanted to find two sticks that could hold the most water. He noticed that the amount of water depended on the distance between the sticks and the shorter stick's height. To find the best pair, he and his friend started at opposite ends and moved inward, always shifting the shorter stick. This smart trick helped them find the biggest water container—just like solving the Container with Most Water problem in coding!</w:t>
+      </w:r>
+    </w:p>
+    <w:p/>
+    <w:p>
+      <w:r>
+        <w:t>Example1:</w:t>
+      </w:r>
+    </w:p>
+    <w:p>
+      <w:r>
+        <w:t>Input: height = [1, 8, 6, 2, 5, 4, 8, 3, 7]</w:t>
+      </w:r>
+    </w:p>
+    <w:p>
+      <w:r>
+        <w:t>Output: 49</w:t>
+      </w:r>
+    </w:p>
+    <w:p>
+      <w:r>
+        <w:t>Explanation: The above vertical lines are represented by an array [1, 8, 6, 2, 5, 4, 8, 3, 7]. In this case, the maximum area of water (blue section) the container can contain is 49.</w:t>
+      </w:r>
+    </w:p>
+    <w:tbl>
+      <w:tblPr>
+        <w:tblW w:w="13440" w:type="dxa"/>
+        <w:tblBorders>
+          <w:top w:val="single" w:sz="2" w:space="0" w:color="auto"/>
+          <w:left w:val="single" w:sz="2" w:space="0" w:color="auto"/>
+          <w:bottom w:val="single" w:sz="2" w:space="0" w:color="auto"/>
+          <w:right w:val="single" w:sz="2" w:space="0" w:color="auto"/>
+        </w:tblBorders>
+        <w:shd w:val="clear" w:color="auto" w:fill="1F2022"/>
+        <w:tblCellMar>
+          <w:left w:w="0" w:type="dxa"/>
+          <w:right w:w="0" w:type="dxa"/>
+        </w:tblCellMar>
+        <w:tblLook w:val="04A0" w:firstRow="1" w:lastRow="0" w:firstColumn="1" w:lastColumn="0" w:noHBand="0" w:noVBand="1"/>
+      </w:tblPr>
+      <w:tblGrid>
+        <w:gridCol w:w="2546"/>
+        <w:gridCol w:w="5308"/>
+        <w:gridCol w:w="5586"/>
+      </w:tblGrid>
+      <w:tr>
+        <w:trPr>
+          <w:tblHeader/>
+        </w:trPr>
+        <w:tc>
+          <w:tcPr>
+            <w:tcW w:w="0" w:type="auto"/>
+            <w:tcBorders>
+              <w:top w:val="single" w:sz="6" w:space="0" w:color="313336"/>
+              <w:left w:val="single" w:sz="2" w:space="0" w:color="313336"/>
+              <w:bottom w:val="single" w:sz="6" w:space="0" w:color="313336"/>
+              <w:right w:val="single" w:sz="2" w:space="0" w:color="313336"/>
+            </w:tcBorders>
+            <w:shd w:val="clear" w:color="auto" w:fill="1F2022"/>
+            <w:vAlign w:val="center"/>
+            <w:hideMark/>
+          </w:tcPr>
+          <w:p>
+            <w:pPr>
+              <w:rPr>
+                <w:b/>
+                <w:bCs/>
+              </w:rPr>
+            </w:pPr>
+            <w:r>
+              <w:rPr>
+                <w:b/>
+                <w:bCs/>
+              </w:rPr>
+              <w:t>Method</w:t>
+            </w:r>
+          </w:p>
+        </w:tc>
+        <w:tc>
+          <w:tcPr>
+            <w:tcW w:w="0" w:type="auto"/>
+            <w:tcBorders>
+              <w:top w:val="single" w:sz="6" w:space="0" w:color="313336"/>
+              <w:left w:val="single" w:sz="2" w:space="0" w:color="313336"/>
+              <w:bottom w:val="single" w:sz="6" w:space="0" w:color="313336"/>
+              <w:right w:val="single" w:sz="2" w:space="0" w:color="313336"/>
+            </w:tcBorders>
+            <w:shd w:val="clear" w:color="auto" w:fill="1F2022"/>
+            <w:vAlign w:val="center"/>
+            <w:hideMark/>
+          </w:tcPr>
+          <w:p>
+            <w:pPr>
+              <w:rPr>
+                <w:b/>
+                <w:bCs/>
+              </w:rPr>
+            </w:pPr>
+            <w:r>
+              <w:rPr>
+                <w:b/>
+                <w:bCs/>
+              </w:rPr>
+              <w:t>Time Complexity</w:t>
+            </w:r>
+          </w:p>
+        </w:tc>
+        <w:tc>
+          <w:tcPr>
+            <w:tcW w:w="0" w:type="auto"/>
+            <w:tcBorders>
+              <w:top w:val="single" w:sz="6" w:space="0" w:color="313336"/>
+              <w:left w:val="single" w:sz="2" w:space="0" w:color="313336"/>
+              <w:bottom w:val="single" w:sz="6" w:space="0" w:color="313336"/>
+              <w:right w:val="single" w:sz="2" w:space="0" w:color="313336"/>
+            </w:tcBorders>
+            <w:shd w:val="clear" w:color="auto" w:fill="1F2022"/>
+            <w:vAlign w:val="center"/>
+            <w:hideMark/>
+          </w:tcPr>
+          <w:p>
+            <w:pPr>
+              <w:rPr>
+                <w:b/>
+                <w:bCs/>
+              </w:rPr>
+            </w:pPr>
+            <w:r>
+              <w:rPr>
+                <w:b/>
+                <w:bCs/>
+              </w:rPr>
+              <w:t>Space Complexity</w:t>
+            </w:r>
+          </w:p>
+        </w:tc>
+      </w:tr>
+      <w:tr>
+        <w:tc>
+          <w:tcPr>
+            <w:tcW w:w="0" w:type="auto"/>
+            <w:tcBorders>
+              <w:top w:val="single" w:sz="2" w:space="0" w:color="313336"/>
+              <w:left w:val="single" w:sz="2" w:space="0" w:color="313336"/>
+              <w:bottom w:val="single" w:sz="6" w:space="0" w:color="313336"/>
+              <w:right w:val="single" w:sz="2" w:space="0" w:color="313336"/>
+            </w:tcBorders>
+            <w:shd w:val="clear" w:color="auto" w:fill="1F2022"/>
+            <w:vAlign w:val="center"/>
+            <w:hideMark/>
+          </w:tcPr>
+          <w:p>
+            <w:r>
+              <w:t>Naive</w:t>
+            </w:r>
+          </w:p>
+        </w:tc>
+        <w:tc>
+          <w:tcPr>
+            <w:tcW w:w="0" w:type="auto"/>
+            <w:tcBorders>
+              <w:top w:val="single" w:sz="2" w:space="0" w:color="313336"/>
+              <w:left w:val="single" w:sz="2" w:space="0" w:color="313336"/>
+              <w:bottom w:val="single" w:sz="6" w:space="0" w:color="313336"/>
+              <w:right w:val="single" w:sz="2" w:space="0" w:color="313336"/>
+            </w:tcBorders>
+            <w:shd w:val="clear" w:color="auto" w:fill="1F2022"/>
+            <w:vAlign w:val="center"/>
+            <w:hideMark/>
+          </w:tcPr>
+          <w:p>
+            <w:r>
+              <w:t>O(n^2)</w:t>
+            </w:r>
+          </w:p>
+        </w:tc>
+        <w:tc>
+          <w:tcPr>
+            <w:tcW w:w="0" w:type="auto"/>
+            <w:tcBorders>
+              <w:top w:val="single" w:sz="2" w:space="0" w:color="313336"/>
+              <w:left w:val="single" w:sz="2" w:space="0" w:color="313336"/>
+              <w:bottom w:val="single" w:sz="6" w:space="0" w:color="313336"/>
+              <w:right w:val="single" w:sz="2" w:space="0" w:color="313336"/>
+            </w:tcBorders>
+            <w:shd w:val="clear" w:color="auto" w:fill="1F2022"/>
+            <w:vAlign w:val="center"/>
+            <w:hideMark/>
+          </w:tcPr>
+          <w:p>
+            <w:proofErr w:type="gramStart"/>
+            <w:r>
+              <w:t>O(</w:t>
+            </w:r>
+            <w:proofErr w:type="gramEnd"/>
+            <w:r>
+              <w:t>1)</w:t>
+            </w:r>
+          </w:p>
+        </w:tc>
+      </w:tr>
+      <w:tr>
+        <w:tc>
+          <w:tcPr>
+            <w:tcW w:w="0" w:type="auto"/>
+            <w:tcBorders>
+              <w:top w:val="single" w:sz="2" w:space="0" w:color="313336"/>
+              <w:left w:val="single" w:sz="2" w:space="0" w:color="313336"/>
+              <w:bottom w:val="single" w:sz="6" w:space="0" w:color="313336"/>
+              <w:right w:val="single" w:sz="2" w:space="0" w:color="313336"/>
+            </w:tcBorders>
+            <w:shd w:val="clear" w:color="auto" w:fill="1F2022"/>
+            <w:vAlign w:val="center"/>
+            <w:hideMark/>
+          </w:tcPr>
+          <w:p>
+            <w:r>
+              <w:t>Best</w:t>
+            </w:r>
+          </w:p>
+        </w:tc>
+        <w:tc>
+          <w:tcPr>
+            <w:tcW w:w="0" w:type="auto"/>
+            <w:tcBorders>
+              <w:top w:val="single" w:sz="2" w:space="0" w:color="313336"/>
+              <w:left w:val="single" w:sz="2" w:space="0" w:color="313336"/>
+              <w:bottom w:val="single" w:sz="6" w:space="0" w:color="313336"/>
+              <w:right w:val="single" w:sz="2" w:space="0" w:color="313336"/>
+            </w:tcBorders>
+            <w:shd w:val="clear" w:color="auto" w:fill="1F2022"/>
+            <w:vAlign w:val="center"/>
+            <w:hideMark/>
+          </w:tcPr>
+          <w:p>
+            <w:r>
+              <w:t>O(n)</w:t>
+            </w:r>
+          </w:p>
+        </w:tc>
+        <w:tc>
+          <w:tcPr>
+            <w:tcW w:w="0" w:type="auto"/>
+            <w:tcBorders>
+              <w:top w:val="single" w:sz="2" w:space="0" w:color="313336"/>
+              <w:left w:val="single" w:sz="2" w:space="0" w:color="313336"/>
+              <w:bottom w:val="single" w:sz="6" w:space="0" w:color="313336"/>
+              <w:right w:val="single" w:sz="2" w:space="0" w:color="313336"/>
+            </w:tcBorders>
+            <w:shd w:val="clear" w:color="auto" w:fill="1F2022"/>
+            <w:vAlign w:val="center"/>
+            <w:hideMark/>
+          </w:tcPr>
+          <w:p>
+            <w:proofErr w:type="gramStart"/>
+            <w:r>
+              <w:t>O(</w:t>
+            </w:r>
+            <w:proofErr w:type="gramEnd"/>
+            <w:r>
+              <w:t>1)</w:t>
+            </w:r>
+          </w:p>
+        </w:tc>
+      </w:tr>
+    </w:tbl>
+    <w:p/>
+    <w:p>
+      <w:pPr>
+        <w:rPr>
+          <w:b/>
+          <w:bCs/>
+        </w:rPr>
+      </w:pPr>
+      <w:r>
+        <w:rPr>
+          <w:b/>
+          <w:bCs/>
+        </w:rPr>
+        <w:t>Approach</w:t>
+      </w:r>
+    </w:p>
+    <w:p>
+      <w:r>
+        <w:rPr>
+          <w:b/>
+          <w:bCs/>
+        </w:rPr>
+        <w:t xml:space="preserve">Using Nested </w:t>
+      </w:r>
+      <w:proofErr w:type="gramStart"/>
+      <w:r>
+        <w:rPr>
+          <w:b/>
+          <w:bCs/>
+        </w:rPr>
+        <w:t>Loops :</w:t>
+      </w:r>
+      <w:proofErr w:type="gramEnd"/>
+    </w:p>
+    <w:p>
+      <w:r>
+        <w:t>Find every possible pair of vertical lines using nested for loop, then determine how much water we can store, and update the maximum water area.</w:t>
+      </w:r>
+    </w:p>
+    <w:p>
+      <w:r>
+        <w:t xml:space="preserve">1. Initialize </w:t>
+      </w:r>
+      <w:proofErr w:type="spellStart"/>
+      <w:r>
+        <w:t>maxWater</w:t>
+      </w:r>
+      <w:proofErr w:type="spellEnd"/>
+      <w:r>
+        <w:t xml:space="preserve"> = 0.</w:t>
+      </w:r>
+    </w:p>
+    <w:p>
+      <w:r>
+        <w:t>2. Use two nested loops to try every possible pair of lines.</w:t>
+      </w:r>
+    </w:p>
+    <w:p>
+      <w:r>
+        <w:t>3. For each pair:</w:t>
+      </w:r>
+    </w:p>
+    <w:p>
+      <w:pPr>
+        <w:numPr>
+          <w:ilvl w:val="0"/>
+          <w:numId w:val="21"/>
+        </w:numPr>
+      </w:pPr>
+      <w:r>
+        <w:t xml:space="preserve">Calculate the width (j - </w:t>
+      </w:r>
+      <w:proofErr w:type="spellStart"/>
+      <w:r>
+        <w:t>i</w:t>
+      </w:r>
+      <w:proofErr w:type="spellEnd"/>
+      <w:r>
+        <w:t>).</w:t>
+      </w:r>
+    </w:p>
+    <w:p>
+      <w:pPr>
+        <w:numPr>
+          <w:ilvl w:val="0"/>
+          <w:numId w:val="21"/>
+        </w:numPr>
+      </w:pPr>
+      <w:r>
+        <w:t>Find the shorter height (min(height[</w:t>
+      </w:r>
+      <w:proofErr w:type="spellStart"/>
+      <w:r>
+        <w:t>i</w:t>
+      </w:r>
+      <w:proofErr w:type="spellEnd"/>
+      <w:r>
+        <w:t>], height[j])).</w:t>
+      </w:r>
+    </w:p>
+    <w:p>
+      <w:pPr>
+        <w:numPr>
+          <w:ilvl w:val="0"/>
+          <w:numId w:val="21"/>
+        </w:numPr>
+      </w:pPr>
+      <w:r>
+        <w:t>Compute the area (width * height).</w:t>
+      </w:r>
+    </w:p>
+    <w:p>
+      <w:pPr>
+        <w:numPr>
+          <w:ilvl w:val="0"/>
+          <w:numId w:val="21"/>
+        </w:numPr>
+      </w:pPr>
+      <w:r>
+        <w:t xml:space="preserve">Update </w:t>
+      </w:r>
+      <w:proofErr w:type="spellStart"/>
+      <w:r>
+        <w:t>maxWater</w:t>
+      </w:r>
+      <w:proofErr w:type="spellEnd"/>
+      <w:r>
+        <w:t xml:space="preserve"> if this area is larger.</w:t>
+      </w:r>
+    </w:p>
+    <w:p>
+      <w:r>
+        <w:t>4. Return the maximum area found after checking all pairs</w:t>
+      </w:r>
+    </w:p>
+    <w:p/>
+    <w:p/>
+    <w:p>
+      <w:pPr>
+        <w:rPr>
+          <w:sz w:val="26"/>
+          <w:szCs w:val="26"/>
+        </w:rPr>
+      </w:pPr>
+    </w:p>
+    <w:p>
+      <w:pPr>
+        <w:rPr>
+          <w:sz w:val="26"/>
+          <w:szCs w:val="26"/>
+        </w:rPr>
+      </w:pPr>
+    </w:p>
+    <w:p>
+      <w:pPr>
+        <w:rPr>
+          <w:sz w:val="26"/>
+          <w:szCs w:val="26"/>
+        </w:rPr>
+      </w:pPr>
+    </w:p>
     <w:sectPr>
       <w:pgSz w:w="11906" w:h="16838"/>
       <w:pgMar w:top="1440" w:right="1440" w:bottom="1440" w:left="1440" w:header="708" w:footer="708" w:gutter="0"/>
@@ -8097,7 +8759,7 @@
 </file>
 
 <file path=word/numbering.xml><?xml version="1.0" encoding="utf-8"?>
-<w:numbering xmlns:wpc="http://schemas.microsoft.com/office/word/2010/wordprocessingCanvas" xmlns:cx="http://schemas.microsoft.com/office/drawing/2014/chartex" xmlns:cx1="http://schemas.microsoft.com/office/drawing/2015/9/8/chartex" xmlns:cx2="http://schemas.microsoft.com/office/drawing/2015/10/21/chartex" xmlns:cx3="http://schemas.microsoft.com/office/drawing/2016/5/9/chartex" xmlns:cx4="http://schemas.microsoft.com/office/drawing/2016/5/10/chartex" xmlns:cx5="http://schemas.microsoft.com/office/drawing/2016/5/11/chartex" xmlns:cx6="http://schemas.microsoft.com/office/drawing/2016/5/12/chartex" xmlns:cx7="http://schemas.microsoft.com/office/drawing/2016/5/13/chartex" xmlns:cx8="http://schemas.microsoft.com/office/drawing/2016/5/14/chartex" xmlns:mc="http://schemas.openxmlformats.org/markup-compatibility/2006" xmlns:aink="http://schemas.microsoft.com/office/drawing/2016/ink" xmlns:am3d="http://schemas.microsoft.com/office/drawing/2017/model3d" xmlns:o="urn:schemas-microsoft-com:office:office" xmlns:oel="http://schemas.microsoft.com/office/2019/extlst" xmlns:r="http://schemas.openxmlformats.org/officeDocument/2006/relationships" xmlns:m="http://schemas.openxmlformats.org/officeDocument/2006/math" xmlns:v="urn:schemas-microsoft-com:vml" xmlns:wp14="http://schemas.microsoft.com/office/word/2010/wordprocessingDrawing" xmlns:wp="http://schemas.openxmlformats.org/drawingml/2006/wordprocessingDrawing" xmlns:w10="urn:schemas-microsoft-com:office:word" xmlns:w="http://schemas.openxmlformats.org/wordprocessingml/2006/main" xmlns:w14="http://schemas.microsoft.com/office/word/2010/wordml" xmlns:w15="http://schemas.microsoft.com/office/word/2012/wordml" xmlns:w16cex="http://schemas.microsoft.com/office/word/2018/wordml/cex" xmlns:w16cid="http://schemas.microsoft.com/office/word/2016/wordml/cid" xmlns:w16="http://schemas.microsoft.com/office/word/2018/wordml" xmlns:w16du="http://schemas.microsoft.com/office/word/2023/wordml/word16du" xmlns:w16sdtdh="http://schemas.microsoft.com/office/word/2020/wordml/sdtdatahash" xmlns:w16sdtfl="http://schemas.microsoft.com/office/word/2024/wordml/sdtformatlock" xmlns:w16se="http://schemas.microsoft.com/office/word/2015/wordml/symex" xmlns:wpg="http://schemas.microsoft.com/office/word/2010/wordprocessingGroup" xmlns:wpi="http://schemas.microsoft.com/office/word/2010/wordprocessingInk" xmlns:wne="http://schemas.microsoft.com/office/word/2006/wordml" xmlns:wps="http://schemas.microsoft.com/office/word/2010/wordprocessingShape" mc:Ignorable="w14 w15 w16se w16cid w16 w16cex w16sdtdh w16sdtfl w16du wp14">
+<w:numbering xmlns:wpc="http://schemas.microsoft.com/office/word/2010/wordprocessingCanvas" xmlns:cx="http://schemas.microsoft.com/office/drawing/2014/chartex" xmlns:cx1="http://schemas.microsoft.com/office/drawing/2015/9/8/chartex" xmlns:cx2="http://schemas.microsoft.com/office/drawing/2015/10/21/chartex" xmlns:cx3="http://schemas.microsoft.com/office/drawing/2016/5/9/chartex" xmlns:cx4="http://schemas.microsoft.com/office/drawing/2016/5/10/chartex" xmlns:cx5="http://schemas.microsoft.com/office/drawing/2016/5/11/chartex" xmlns:cx6="http://schemas.microsoft.com/office/drawing/2016/5/12/chartex" xmlns:cx7="http://schemas.microsoft.com/office/drawing/2016/5/13/chartex" xmlns:cx8="http://schemas.microsoft.com/office/drawing/2016/5/14/chartex" xmlns:mc="http://schemas.openxmlformats.org/markup-compatibility/2006" xmlns:aink="http://schemas.microsoft.com/office/drawing/2016/ink" xmlns:am3d="http://schemas.microsoft.com/office/drawing/2017/model3d" xmlns:o="urn:schemas-microsoft-com:office:office" xmlns:oel="http://schemas.microsoft.com/office/2019/extlst" xmlns:r="http://schemas.openxmlformats.org/officeDocument/2006/relationships" xmlns:m="http://schemas.openxmlformats.org/officeDocument/2006/math" xmlns:v="urn:schemas-microsoft-com:vml" xmlns:wp14="http://schemas.microsoft.com/office/word/2010/wordprocessingDrawing" xmlns:wp="http://schemas.openxmlformats.org/drawingml/2006/wordprocessingDrawing" xmlns:w10="urn:schemas-microsoft-com:office:word" xmlns:w="http://schemas.openxmlformats.org/wordprocessingml/2006/main" xmlns:w14="http://schemas.microsoft.com/office/word/2010/wordml" xmlns:w15="http://schemas.microsoft.com/office/word/2012/wordml" xmlns:w16cei="http://schemas.microsoft.com/office/word/2026/wordml/cei" xmlns:w16cex="http://schemas.microsoft.com/office/word/2018/wordml/cex" xmlns:w16cid="http://schemas.microsoft.com/office/word/2016/wordml/cid" xmlns:w16="http://schemas.microsoft.com/office/word/2018/wordml" xmlns:w16du="http://schemas.microsoft.com/office/word/2023/wordml/word16du" xmlns:w16sdtdh="http://schemas.microsoft.com/office/word/2020/wordml/sdtdatahash" xmlns:w16sdtfl="http://schemas.microsoft.com/office/word/2024/wordml/sdtformatlock" xmlns:w16se="http://schemas.microsoft.com/office/word/2015/wordml/symex" xmlns:wpg="http://schemas.microsoft.com/office/word/2010/wordprocessingGroup" xmlns:wpi="http://schemas.microsoft.com/office/word/2010/wordprocessingInk" xmlns:wne="http://schemas.microsoft.com/office/word/2006/wordml" xmlns:wps="http://schemas.microsoft.com/office/word/2010/wordprocessingShape" mc:Ignorable="w14 w15 w16se w16cid w16 w16cex w16sdtdh w16sdtfl w16du wp14">
   <w:abstractNum w:abstractNumId="0" w15:restartNumberingAfterBreak="0">
     <w:nsid w:val="02C44FA8"/>
     <w:multiLevelType w:val="multilevel"/>
@@ -8993,6 +9655,155 @@
     </w:lvl>
   </w:abstractNum>
   <w:abstractNum w:abstractNumId="6" w15:restartNumberingAfterBreak="0">
+    <w:nsid w:val="1691627C"/>
+    <w:multiLevelType w:val="multilevel"/>
+    <w:tmpl w:val="1B5A95E6"/>
+    <w:lvl w:ilvl="0">
+      <w:start w:val="1"/>
+      <w:numFmt w:val="bullet"/>
+      <w:lvlText w:val=""/>
+      <w:lvlJc w:val="left"/>
+      <w:pPr>
+        <w:tabs>
+          <w:tab w:val="num" w:pos="720"/>
+        </w:tabs>
+        <w:ind w:left="720" w:hanging="360"/>
+      </w:pPr>
+      <w:rPr>
+        <w:rFonts w:ascii="Symbol" w:hAnsi="Symbol" w:hint="default"/>
+        <w:sz w:val="20"/>
+      </w:rPr>
+    </w:lvl>
+    <w:lvl w:ilvl="1" w:tentative="1">
+      <w:start w:val="1"/>
+      <w:numFmt w:val="bullet"/>
+      <w:lvlText w:val=""/>
+      <w:lvlJc w:val="left"/>
+      <w:pPr>
+        <w:tabs>
+          <w:tab w:val="num" w:pos="1440"/>
+        </w:tabs>
+        <w:ind w:left="1440" w:hanging="360"/>
+      </w:pPr>
+      <w:rPr>
+        <w:rFonts w:ascii="Symbol" w:hAnsi="Symbol" w:hint="default"/>
+        <w:sz w:val="20"/>
+      </w:rPr>
+    </w:lvl>
+    <w:lvl w:ilvl="2" w:tentative="1">
+      <w:start w:val="1"/>
+      <w:numFmt w:val="bullet"/>
+      <w:lvlText w:val=""/>
+      <w:lvlJc w:val="left"/>
+      <w:pPr>
+        <w:tabs>
+          <w:tab w:val="num" w:pos="2160"/>
+        </w:tabs>
+        <w:ind w:left="2160" w:hanging="360"/>
+      </w:pPr>
+      <w:rPr>
+        <w:rFonts w:ascii="Symbol" w:hAnsi="Symbol" w:hint="default"/>
+        <w:sz w:val="20"/>
+      </w:rPr>
+    </w:lvl>
+    <w:lvl w:ilvl="3" w:tentative="1">
+      <w:start w:val="1"/>
+      <w:numFmt w:val="bullet"/>
+      <w:lvlText w:val=""/>
+      <w:lvlJc w:val="left"/>
+      <w:pPr>
+        <w:tabs>
+          <w:tab w:val="num" w:pos="2880"/>
+        </w:tabs>
+        <w:ind w:left="2880" w:hanging="360"/>
+      </w:pPr>
+      <w:rPr>
+        <w:rFonts w:ascii="Symbol" w:hAnsi="Symbol" w:hint="default"/>
+        <w:sz w:val="20"/>
+      </w:rPr>
+    </w:lvl>
+    <w:lvl w:ilvl="4" w:tentative="1">
+      <w:start w:val="1"/>
+      <w:numFmt w:val="bullet"/>
+      <w:lvlText w:val=""/>
+      <w:lvlJc w:val="left"/>
+      <w:pPr>
+        <w:tabs>
+          <w:tab w:val="num" w:pos="3600"/>
+        </w:tabs>
+        <w:ind w:left="3600" w:hanging="360"/>
+      </w:pPr>
+      <w:rPr>
+        <w:rFonts w:ascii="Symbol" w:hAnsi="Symbol" w:hint="default"/>
+        <w:sz w:val="20"/>
+      </w:rPr>
+    </w:lvl>
+    <w:lvl w:ilvl="5" w:tentative="1">
+      <w:start w:val="1"/>
+      <w:numFmt w:val="bullet"/>
+      <w:lvlText w:val=""/>
+      <w:lvlJc w:val="left"/>
+      <w:pPr>
+        <w:tabs>
+          <w:tab w:val="num" w:pos="4320"/>
+        </w:tabs>
+        <w:ind w:left="4320" w:hanging="360"/>
+      </w:pPr>
+      <w:rPr>
+        <w:rFonts w:ascii="Symbol" w:hAnsi="Symbol" w:hint="default"/>
+        <w:sz w:val="20"/>
+      </w:rPr>
+    </w:lvl>
+    <w:lvl w:ilvl="6" w:tentative="1">
+      <w:start w:val="1"/>
+      <w:numFmt w:val="bullet"/>
+      <w:lvlText w:val=""/>
+      <w:lvlJc w:val="left"/>
+      <w:pPr>
+        <w:tabs>
+          <w:tab w:val="num" w:pos="5040"/>
+        </w:tabs>
+        <w:ind w:left="5040" w:hanging="360"/>
+      </w:pPr>
+      <w:rPr>
+        <w:rFonts w:ascii="Symbol" w:hAnsi="Symbol" w:hint="default"/>
+        <w:sz w:val="20"/>
+      </w:rPr>
+    </w:lvl>
+    <w:lvl w:ilvl="7" w:tentative="1">
+      <w:start w:val="1"/>
+      <w:numFmt w:val="bullet"/>
+      <w:lvlText w:val=""/>
+      <w:lvlJc w:val="left"/>
+      <w:pPr>
+        <w:tabs>
+          <w:tab w:val="num" w:pos="5760"/>
+        </w:tabs>
+        <w:ind w:left="5760" w:hanging="360"/>
+      </w:pPr>
+      <w:rPr>
+        <w:rFonts w:ascii="Symbol" w:hAnsi="Symbol" w:hint="default"/>
+        <w:sz w:val="20"/>
+      </w:rPr>
+    </w:lvl>
+    <w:lvl w:ilvl="8" w:tentative="1">
+      <w:start w:val="1"/>
+      <w:numFmt w:val="bullet"/>
+      <w:lvlText w:val=""/>
+      <w:lvlJc w:val="left"/>
+      <w:pPr>
+        <w:tabs>
+          <w:tab w:val="num" w:pos="6480"/>
+        </w:tabs>
+        <w:ind w:left="6480" w:hanging="360"/>
+      </w:pPr>
+      <w:rPr>
+        <w:rFonts w:ascii="Symbol" w:hAnsi="Symbol" w:hint="default"/>
+        <w:sz w:val="20"/>
+      </w:rPr>
+    </w:lvl>
+  </w:abstractNum>
+  <w:abstractNum w:abstractNumId="7" w15:restartNumberingAfterBreak="0">
     <w:nsid w:val="19003D3E"/>
     <w:multiLevelType w:val="multilevel"/>
     <w:tmpl w:val="842E5A4A"/>
@@ -9141,7 +9952,7 @@
       </w:rPr>
     </w:lvl>
   </w:abstractNum>
-  <w:abstractNum w:abstractNumId="7" w15:restartNumberingAfterBreak="0">
+  <w:abstractNum w:abstractNumId="8" w15:restartNumberingAfterBreak="0">
     <w:nsid w:val="1AB94F04"/>
     <w:multiLevelType w:val="multilevel"/>
     <w:tmpl w:val="3858D5FC"/>
@@ -9290,7 +10101,7 @@
       </w:rPr>
     </w:lvl>
   </w:abstractNum>
-  <w:abstractNum w:abstractNumId="8" w15:restartNumberingAfterBreak="0">
+  <w:abstractNum w:abstractNumId="9" w15:restartNumberingAfterBreak="0">
     <w:nsid w:val="1BAB34BD"/>
     <w:multiLevelType w:val="multilevel"/>
     <w:tmpl w:val="C7A6D49E"/>
@@ -9439,7 +10250,7 @@
       </w:rPr>
     </w:lvl>
   </w:abstractNum>
-  <w:abstractNum w:abstractNumId="9" w15:restartNumberingAfterBreak="0">
+  <w:abstractNum w:abstractNumId="10" w15:restartNumberingAfterBreak="0">
     <w:nsid w:val="35A95BC9"/>
     <w:multiLevelType w:val="multilevel"/>
     <w:tmpl w:val="0D7E1900"/>
@@ -9588,7 +10399,7 @@
       </w:rPr>
     </w:lvl>
   </w:abstractNum>
-  <w:abstractNum w:abstractNumId="10" w15:restartNumberingAfterBreak="0">
+  <w:abstractNum w:abstractNumId="11" w15:restartNumberingAfterBreak="0">
     <w:nsid w:val="3C12387D"/>
     <w:multiLevelType w:val="multilevel"/>
     <w:tmpl w:val="9E14104A"/>
@@ -9737,7 +10548,7 @@
       </w:rPr>
     </w:lvl>
   </w:abstractNum>
-  <w:abstractNum w:abstractNumId="11" w15:restartNumberingAfterBreak="0">
+  <w:abstractNum w:abstractNumId="12" w15:restartNumberingAfterBreak="0">
     <w:nsid w:val="42823EE6"/>
     <w:multiLevelType w:val="multilevel"/>
     <w:tmpl w:val="8EE8D394"/>
@@ -9886,7 +10697,7 @@
       </w:rPr>
     </w:lvl>
   </w:abstractNum>
-  <w:abstractNum w:abstractNumId="12" w15:restartNumberingAfterBreak="0">
+  <w:abstractNum w:abstractNumId="13" w15:restartNumberingAfterBreak="0">
     <w:nsid w:val="4F3E539F"/>
     <w:multiLevelType w:val="multilevel"/>
     <w:tmpl w:val="8382A780"/>
@@ -10035,7 +10846,7 @@
       </w:rPr>
     </w:lvl>
   </w:abstractNum>
-  <w:abstractNum w:abstractNumId="13" w15:restartNumberingAfterBreak="0">
+  <w:abstractNum w:abstractNumId="14" w15:restartNumberingAfterBreak="0">
     <w:nsid w:val="4F843E15"/>
     <w:multiLevelType w:val="multilevel"/>
     <w:tmpl w:val="E6D879DC"/>
@@ -10184,7 +10995,7 @@
       </w:rPr>
     </w:lvl>
   </w:abstractNum>
-  <w:abstractNum w:abstractNumId="14" w15:restartNumberingAfterBreak="0">
+  <w:abstractNum w:abstractNumId="15" w15:restartNumberingAfterBreak="0">
     <w:nsid w:val="50DB300F"/>
     <w:multiLevelType w:val="multilevel"/>
     <w:tmpl w:val="DCC0545C"/>
@@ -10333,7 +11144,7 @@
       </w:rPr>
     </w:lvl>
   </w:abstractNum>
-  <w:abstractNum w:abstractNumId="15" w15:restartNumberingAfterBreak="0">
+  <w:abstractNum w:abstractNumId="16" w15:restartNumberingAfterBreak="0">
     <w:nsid w:val="544A7336"/>
     <w:multiLevelType w:val="multilevel"/>
     <w:tmpl w:val="754A0798"/>
@@ -10482,7 +11293,7 @@
       </w:rPr>
     </w:lvl>
   </w:abstractNum>
-  <w:abstractNum w:abstractNumId="16" w15:restartNumberingAfterBreak="0">
+  <w:abstractNum w:abstractNumId="17" w15:restartNumberingAfterBreak="0">
     <w:nsid w:val="576171E3"/>
     <w:multiLevelType w:val="multilevel"/>
     <w:tmpl w:val="DF80DC3E"/>
@@ -10631,7 +11442,7 @@
       </w:rPr>
     </w:lvl>
   </w:abstractNum>
-  <w:abstractNum w:abstractNumId="17" w15:restartNumberingAfterBreak="0">
+  <w:abstractNum w:abstractNumId="18" w15:restartNumberingAfterBreak="0">
     <w:nsid w:val="5D6538FB"/>
     <w:multiLevelType w:val="multilevel"/>
     <w:tmpl w:val="5E30CCB8"/>
@@ -10780,7 +11591,7 @@
       </w:rPr>
     </w:lvl>
   </w:abstractNum>
-  <w:abstractNum w:abstractNumId="18" w15:restartNumberingAfterBreak="0">
+  <w:abstractNum w:abstractNumId="19" w15:restartNumberingAfterBreak="0">
     <w:nsid w:val="764F176E"/>
     <w:multiLevelType w:val="multilevel"/>
     <w:tmpl w:val="3530BD80"/>
@@ -10929,7 +11740,7 @@
       </w:rPr>
     </w:lvl>
   </w:abstractNum>
-  <w:abstractNum w:abstractNumId="19" w15:restartNumberingAfterBreak="0">
+  <w:abstractNum w:abstractNumId="20" w15:restartNumberingAfterBreak="0">
     <w:nsid w:val="79A0453D"/>
     <w:multiLevelType w:val="multilevel"/>
     <w:tmpl w:val="F16C64C6"/>
@@ -11082,61 +11893,64 @@
     <w:abstractNumId w:val="5"/>
   </w:num>
   <w:num w:numId="2" w16cid:durableId="1049644441">
-    <w:abstractNumId w:val="11"/>
+    <w:abstractNumId w:val="12"/>
   </w:num>
   <w:num w:numId="3" w16cid:durableId="855195527">
-    <w:abstractNumId w:val="12"/>
+    <w:abstractNumId w:val="13"/>
   </w:num>
   <w:num w:numId="4" w16cid:durableId="1456169704">
-    <w:abstractNumId w:val="15"/>
+    <w:abstractNumId w:val="16"/>
   </w:num>
   <w:num w:numId="5" w16cid:durableId="613444548">
-    <w:abstractNumId w:val="18"/>
+    <w:abstractNumId w:val="19"/>
   </w:num>
   <w:num w:numId="6" w16cid:durableId="269171363">
     <w:abstractNumId w:val="1"/>
   </w:num>
   <w:num w:numId="7" w16cid:durableId="920456329">
-    <w:abstractNumId w:val="13"/>
+    <w:abstractNumId w:val="14"/>
   </w:num>
   <w:num w:numId="8" w16cid:durableId="811756253">
+    <w:abstractNumId w:val="9"/>
+  </w:num>
+  <w:num w:numId="9" w16cid:durableId="1310598230">
     <w:abstractNumId w:val="8"/>
   </w:num>
-  <w:num w:numId="9" w16cid:durableId="1310598230">
-    <w:abstractNumId w:val="7"/>
-  </w:num>
   <w:num w:numId="10" w16cid:durableId="788863381">
-    <w:abstractNumId w:val="17"/>
+    <w:abstractNumId w:val="18"/>
   </w:num>
   <w:num w:numId="11" w16cid:durableId="1725178185">
     <w:abstractNumId w:val="4"/>
   </w:num>
   <w:num w:numId="12" w16cid:durableId="791090743">
-    <w:abstractNumId w:val="9"/>
+    <w:abstractNumId w:val="10"/>
   </w:num>
   <w:num w:numId="13" w16cid:durableId="1897428191">
-    <w:abstractNumId w:val="16"/>
+    <w:abstractNumId w:val="17"/>
   </w:num>
   <w:num w:numId="14" w16cid:durableId="1205559669">
-    <w:abstractNumId w:val="19"/>
+    <w:abstractNumId w:val="20"/>
   </w:num>
   <w:num w:numId="15" w16cid:durableId="1427966037">
     <w:abstractNumId w:val="2"/>
   </w:num>
   <w:num w:numId="16" w16cid:durableId="1589730193">
-    <w:abstractNumId w:val="14"/>
+    <w:abstractNumId w:val="15"/>
   </w:num>
   <w:num w:numId="17" w16cid:durableId="888999740">
     <w:abstractNumId w:val="3"/>
   </w:num>
   <w:num w:numId="18" w16cid:durableId="627711037">
-    <w:abstractNumId w:val="6"/>
+    <w:abstractNumId w:val="7"/>
   </w:num>
   <w:num w:numId="19" w16cid:durableId="1442726740">
     <w:abstractNumId w:val="0"/>
   </w:num>
   <w:num w:numId="20" w16cid:durableId="762262061">
-    <w:abstractNumId w:val="10"/>
+    <w:abstractNumId w:val="11"/>
+  </w:num>
+  <w:num w:numId="21" w16cid:durableId="594216942">
+    <w:abstractNumId w:val="6"/>
   </w:num>
 </w:numbering>
 </file>

</xml_diff>